<commit_message>
Add current RDF timeseries spec
This commit adds the current Turtle specification for the RDF time series model, including a snippet definition with timestamps, update state, producer metadata, and typed columns. It also updates the Word specification document and removes the temporary lock file created by Microsoft Office.
</commit_message>
<xml_diff>
--- a/Spec document.docx
+++ b/Spec document.docx
@@ -65,6 +65,38 @@
       </w:pPr>
       <w:r>
         <w:t>Appending of new time series readings should not affect metadata that exists in RDF</w:t>
+      </w:r>
+    </w:p>
+    <w:p>
+      <w:pPr>
+        <w:pStyle w:val="Heading1"/>
+      </w:pPr>
+      <w:r>
+        <w:t>Unanswered questions</w:t>
+      </w:r>
+    </w:p>
+    <w:p>
+      <w:pPr>
+        <w:pStyle w:val="ListParagraph"/>
+        <w:numPr>
+          <w:ilvl w:val="0"/>
+          <w:numId w:val="3"/>
+        </w:numPr>
+      </w:pPr>
+      <w:r>
+        <w:t>Does the time series exist per device or per sensor?</w:t>
+      </w:r>
+    </w:p>
+    <w:p>
+      <w:pPr>
+        <w:pStyle w:val="ListParagraph"/>
+        <w:numPr>
+          <w:ilvl w:val="0"/>
+          <w:numId w:val="3"/>
+        </w:numPr>
+      </w:pPr>
+      <w:r>
+        <w:t>How to associate column names with units and data types?</w:t>
       </w:r>
     </w:p>
     <w:p/>
@@ -194,6 +226,119 @@
     </w:lvl>
   </w:abstractNum>
   <w:abstractNum w:abstractNumId="1" w15:restartNumberingAfterBreak="0">
+    <w:nsid w:val="6F612FEC"/>
+    <w:multiLevelType w:val="hybridMultilevel"/>
+    <w:tmpl w:val="6EE4C3C2"/>
+    <w:lvl w:ilvl="0" w:tplc="04090001">
+      <w:start w:val="1"/>
+      <w:numFmt w:val="bullet"/>
+      <w:lvlText w:val=""/>
+      <w:lvlJc w:val="left"/>
+      <w:pPr>
+        <w:ind w:left="720" w:hanging="360"/>
+      </w:pPr>
+      <w:rPr>
+        <w:rFonts w:ascii="Symbol" w:hAnsi="Symbol" w:hint="default"/>
+      </w:rPr>
+    </w:lvl>
+    <w:lvl w:ilvl="1" w:tplc="04090003" w:tentative="1">
+      <w:start w:val="1"/>
+      <w:numFmt w:val="bullet"/>
+      <w:lvlText w:val="o"/>
+      <w:lvlJc w:val="left"/>
+      <w:pPr>
+        <w:ind w:left="1440" w:hanging="360"/>
+      </w:pPr>
+      <w:rPr>
+        <w:rFonts w:ascii="Courier New" w:hAnsi="Courier New" w:cs="Courier New" w:hint="default"/>
+      </w:rPr>
+    </w:lvl>
+    <w:lvl w:ilvl="2" w:tplc="04090005" w:tentative="1">
+      <w:start w:val="1"/>
+      <w:numFmt w:val="bullet"/>
+      <w:lvlText w:val=""/>
+      <w:lvlJc w:val="left"/>
+      <w:pPr>
+        <w:ind w:left="2160" w:hanging="360"/>
+      </w:pPr>
+      <w:rPr>
+        <w:rFonts w:ascii="Wingdings" w:hAnsi="Wingdings" w:hint="default"/>
+      </w:rPr>
+    </w:lvl>
+    <w:lvl w:ilvl="3" w:tplc="04090001" w:tentative="1">
+      <w:start w:val="1"/>
+      <w:numFmt w:val="bullet"/>
+      <w:lvlText w:val=""/>
+      <w:lvlJc w:val="left"/>
+      <w:pPr>
+        <w:ind w:left="2880" w:hanging="360"/>
+      </w:pPr>
+      <w:rPr>
+        <w:rFonts w:ascii="Symbol" w:hAnsi="Symbol" w:hint="default"/>
+      </w:rPr>
+    </w:lvl>
+    <w:lvl w:ilvl="4" w:tplc="04090003" w:tentative="1">
+      <w:start w:val="1"/>
+      <w:numFmt w:val="bullet"/>
+      <w:lvlText w:val="o"/>
+      <w:lvlJc w:val="left"/>
+      <w:pPr>
+        <w:ind w:left="3600" w:hanging="360"/>
+      </w:pPr>
+      <w:rPr>
+        <w:rFonts w:ascii="Courier New" w:hAnsi="Courier New" w:cs="Courier New" w:hint="default"/>
+      </w:rPr>
+    </w:lvl>
+    <w:lvl w:ilvl="5" w:tplc="04090005" w:tentative="1">
+      <w:start w:val="1"/>
+      <w:numFmt w:val="bullet"/>
+      <w:lvlText w:val=""/>
+      <w:lvlJc w:val="left"/>
+      <w:pPr>
+        <w:ind w:left="4320" w:hanging="360"/>
+      </w:pPr>
+      <w:rPr>
+        <w:rFonts w:ascii="Wingdings" w:hAnsi="Wingdings" w:hint="default"/>
+      </w:rPr>
+    </w:lvl>
+    <w:lvl w:ilvl="6" w:tplc="04090001" w:tentative="1">
+      <w:start w:val="1"/>
+      <w:numFmt w:val="bullet"/>
+      <w:lvlText w:val=""/>
+      <w:lvlJc w:val="left"/>
+      <w:pPr>
+        <w:ind w:left="5040" w:hanging="360"/>
+      </w:pPr>
+      <w:rPr>
+        <w:rFonts w:ascii="Symbol" w:hAnsi="Symbol" w:hint="default"/>
+      </w:rPr>
+    </w:lvl>
+    <w:lvl w:ilvl="7" w:tplc="04090003" w:tentative="1">
+      <w:start w:val="1"/>
+      <w:numFmt w:val="bullet"/>
+      <w:lvlText w:val="o"/>
+      <w:lvlJc w:val="left"/>
+      <w:pPr>
+        <w:ind w:left="5760" w:hanging="360"/>
+      </w:pPr>
+      <w:rPr>
+        <w:rFonts w:ascii="Courier New" w:hAnsi="Courier New" w:cs="Courier New" w:hint="default"/>
+      </w:rPr>
+    </w:lvl>
+    <w:lvl w:ilvl="8" w:tplc="04090005" w:tentative="1">
+      <w:start w:val="1"/>
+      <w:numFmt w:val="bullet"/>
+      <w:lvlText w:val=""/>
+      <w:lvlJc w:val="left"/>
+      <w:pPr>
+        <w:ind w:left="6480" w:hanging="360"/>
+      </w:pPr>
+      <w:rPr>
+        <w:rFonts w:ascii="Wingdings" w:hAnsi="Wingdings" w:hint="default"/>
+      </w:rPr>
+    </w:lvl>
+  </w:abstractNum>
+  <w:abstractNum w:abstractNumId="2" w15:restartNumberingAfterBreak="0">
     <w:nsid w:val="7E9F6C63"/>
     <w:multiLevelType w:val="hybridMultilevel"/>
     <w:tmpl w:val="E58E341A"/>
@@ -307,10 +452,13 @@
     </w:lvl>
   </w:abstractNum>
   <w:num w:numId="1" w16cid:durableId="228881815">
-    <w:abstractNumId w:val="1"/>
+    <w:abstractNumId w:val="2"/>
   </w:num>
   <w:num w:numId="2" w16cid:durableId="1369522800">
     <w:abstractNumId w:val="0"/>
+  </w:num>
+  <w:num w:numId="3" w16cid:durableId="1729106206">
+    <w:abstractNumId w:val="1"/>
   </w:num>
 </w:numbering>
 </file>

</xml_diff>

<commit_message>
Use CSVW/LDES schema and enrich columns
Refactor Current_Spec.ttl to adopt csvw and ldes vocabularies: remove rdfs prefix, add ldes and csvw prefixes, and model TSS2:ID as both TSS2:Snippet and csvw:Table. Add csvw:url, startTime, isUpdating, committedUntil, producedBy, an ldes:retentionPolicy, and a csvw:tableSchema with primaryKey "timestamp". Replace the old TSS2:Columns list with csvw:column entries that include datatype, units, and sosa observedProperty/madeBySensor metadata. Also update the Spec document.docx binary.
</commit_message>
<xml_diff>
--- a/Spec document.docx
+++ b/Spec document.docx
@@ -69,37 +69,895 @@
     </w:p>
     <w:p>
       <w:pPr>
+        <w:pStyle w:val="ListParagraph"/>
+        <w:numPr>
+          <w:ilvl w:val="0"/>
+          <w:numId w:val="2"/>
+        </w:numPr>
+      </w:pPr>
+      <w:r>
+        <w:t>A</w:t>
+      </w:r>
+      <w:r>
+        <w:t>ssociate column names with units and data types</w:t>
+      </w:r>
+    </w:p>
+    <w:p>
+      <w:pPr>
+        <w:pStyle w:val="ListParagraph"/>
+        <w:numPr>
+          <w:ilvl w:val="0"/>
+          <w:numId w:val="2"/>
+        </w:numPr>
+      </w:pPr>
+      <w:r>
+        <w:t>Operating on sensor network rather than one single senor</w:t>
+      </w:r>
+    </w:p>
+    <w:p>
+      <w:pPr>
+        <w:pStyle w:val="ListParagraph"/>
+        <w:numPr>
+          <w:ilvl w:val="0"/>
+          <w:numId w:val="2"/>
+        </w:numPr>
+      </w:pPr>
+      <w:r>
+        <w:t>Link to actual CSV data files</w:t>
+      </w:r>
+    </w:p>
+    <w:p>
+      <w:pPr>
         <w:pStyle w:val="Heading1"/>
       </w:pPr>
       <w:r>
         <w:t>Unanswered questions</w:t>
       </w:r>
     </w:p>
+    <w:p/>
     <w:p>
       <w:pPr>
-        <w:pStyle w:val="ListParagraph"/>
-        <w:numPr>
-          <w:ilvl w:val="0"/>
-          <w:numId w:val="3"/>
-        </w:numPr>
+        <w:pStyle w:val="Heading1"/>
       </w:pPr>
       <w:r>
-        <w:t>Does the time series exist per device or per sensor?</w:t>
+        <w:t>Attribute Reference</w:t>
       </w:r>
     </w:p>
     <w:p>
-      <w:pPr>
-        <w:pStyle w:val="ListParagraph"/>
-        <w:numPr>
-          <w:ilvl w:val="0"/>
-          <w:numId w:val="3"/>
-        </w:numPr>
-      </w:pPr>
       <w:r>
-        <w:t>How to associate column names with units and data types?</w:t>
+        <w:t>The table below explains every attribute (predicate) used in the current TSS2 specification, which vocabulary it comes from, and what level of the structure it applies to.</w:t>
       </w:r>
     </w:p>
-    <w:p/>
+    <w:tbl>
+      <w:tblPr>
+        <w:tblW w:type="auto" w:w="0"/>
+        <w:tblLook w:firstColumn="1" w:firstRow="1" w:lastColumn="0" w:lastRow="0" w:noHBand="0" w:noVBand="1" w:val="04A0"/>
+        <w:tblBorders>
+          <w:top w:val="single" w:sz="4" w:space="0" w:color="999999"/>
+          <w:left w:val="single" w:sz="4" w:space="0" w:color="999999"/>
+          <w:bottom w:val="single" w:sz="4" w:space="0" w:color="999999"/>
+          <w:right w:val="single" w:sz="4" w:space="0" w:color="999999"/>
+          <w:insideH w:val="single" w:sz="4" w:space="0" w:color="999999"/>
+          <w:insideV w:val="single" w:sz="4" w:space="0" w:color="999999"/>
+        </w:tblBorders>
+      </w:tblPr>
+      <w:tblGrid>
+        <w:gridCol w:w="2340"/>
+        <w:gridCol w:w="2340"/>
+        <w:gridCol w:w="2340"/>
+        <w:gridCol w:w="2340"/>
+      </w:tblGrid>
+      <w:tr>
+        <w:tc>
+          <w:tcPr>
+            <w:tcW w:type="dxa" w:w="2340"/>
+          </w:tcPr>
+          <w:p>
+            <w:r>
+              <w:rPr>
+                <w:b/>
+              </w:rPr>
+              <w:t>Attribute</w:t>
+            </w:r>
+          </w:p>
+        </w:tc>
+        <w:tc>
+          <w:tcPr>
+            <w:tcW w:type="dxa" w:w="2340"/>
+          </w:tcPr>
+          <w:p>
+            <w:r>
+              <w:rPr>
+                <w:b/>
+              </w:rPr>
+              <w:t>Vocabulary</w:t>
+            </w:r>
+          </w:p>
+        </w:tc>
+        <w:tc>
+          <w:tcPr>
+            <w:tcW w:type="dxa" w:w="2340"/>
+          </w:tcPr>
+          <w:p>
+            <w:r>
+              <w:rPr>
+                <w:b/>
+              </w:rPr>
+              <w:t>Applies to</w:t>
+            </w:r>
+          </w:p>
+        </w:tc>
+        <w:tc>
+          <w:tcPr>
+            <w:tcW w:type="dxa" w:w="2340"/>
+          </w:tcPr>
+          <w:p>
+            <w:r>
+              <w:rPr>
+                <w:b/>
+              </w:rPr>
+              <w:t>Description</w:t>
+            </w:r>
+          </w:p>
+        </w:tc>
+      </w:tr>
+      <w:tr>
+        <w:tc>
+          <w:tcPr>
+            <w:tcW w:type="dxa" w:w="2340"/>
+          </w:tcPr>
+          <w:p>
+            <w:r>
+              <w:t>rdf:type</w:t>
+            </w:r>
+          </w:p>
+        </w:tc>
+        <w:tc>
+          <w:tcPr>
+            <w:tcW w:type="dxa" w:w="2340"/>
+          </w:tcPr>
+          <w:p>
+            <w:r>
+              <w:t>RDF</w:t>
+            </w:r>
+          </w:p>
+        </w:tc>
+        <w:tc>
+          <w:tcPr>
+            <w:tcW w:type="dxa" w:w="2340"/>
+          </w:tcPr>
+          <w:p>
+            <w:r>
+              <w:t>Snippet</w:t>
+            </w:r>
+          </w:p>
+        </w:tc>
+        <w:tc>
+          <w:tcPr>
+            <w:tcW w:type="dxa" w:w="2340"/>
+          </w:tcPr>
+          <w:p>
+            <w:r>
+              <w:t>Marks the resource as both a TSS2:Snippet and a csvw:Table.</w:t>
+            </w:r>
+          </w:p>
+        </w:tc>
+      </w:tr>
+      <w:tr>
+        <w:tc>
+          <w:tcPr>
+            <w:tcW w:type="dxa" w:w="2340"/>
+          </w:tcPr>
+          <w:p>
+            <w:r>
+              <w:t>csvw:url</w:t>
+            </w:r>
+          </w:p>
+        </w:tc>
+        <w:tc>
+          <w:tcPr>
+            <w:tcW w:type="dxa" w:w="2340"/>
+          </w:tcPr>
+          <w:p>
+            <w:r>
+              <w:t>CSVW</w:t>
+            </w:r>
+          </w:p>
+        </w:tc>
+        <w:tc>
+          <w:tcPr>
+            <w:tcW w:type="dxa" w:w="2340"/>
+          </w:tcPr>
+          <w:p>
+            <w:r>
+              <w:t>Snippet</w:t>
+            </w:r>
+          </w:p>
+        </w:tc>
+        <w:tc>
+          <w:tcPr>
+            <w:tcW w:type="dxa" w:w="2340"/>
+          </w:tcPr>
+          <w:p>
+            <w:r>
+              <w:t>Location of the actual CSV file containing the raw time series values.</w:t>
+            </w:r>
+          </w:p>
+        </w:tc>
+      </w:tr>
+      <w:tr>
+        <w:tc>
+          <w:tcPr>
+            <w:tcW w:type="dxa" w:w="2340"/>
+          </w:tcPr>
+          <w:p>
+            <w:r>
+              <w:t>TSS2:startTime</w:t>
+            </w:r>
+          </w:p>
+        </w:tc>
+        <w:tc>
+          <w:tcPr>
+            <w:tcW w:type="dxa" w:w="2340"/>
+          </w:tcPr>
+          <w:p>
+            <w:r>
+              <w:t>TSS2</w:t>
+            </w:r>
+          </w:p>
+        </w:tc>
+        <w:tc>
+          <w:tcPr>
+            <w:tcW w:type="dxa" w:w="2340"/>
+          </w:tcPr>
+          <w:p>
+            <w:r>
+              <w:t>Snippet</w:t>
+            </w:r>
+          </w:p>
+        </w:tc>
+        <w:tc>
+          <w:tcPr>
+            <w:tcW w:type="dxa" w:w="2340"/>
+          </w:tcPr>
+          <w:p>
+            <w:r>
+              <w:t>Start of the time range this snippet's metadata describes.</w:t>
+            </w:r>
+          </w:p>
+        </w:tc>
+      </w:tr>
+      <w:tr>
+        <w:tc>
+          <w:tcPr>
+            <w:tcW w:type="dxa" w:w="2340"/>
+          </w:tcPr>
+          <w:p>
+            <w:r>
+              <w:t>TSS2:isUpdating</w:t>
+            </w:r>
+          </w:p>
+        </w:tc>
+        <w:tc>
+          <w:tcPr>
+            <w:tcW w:type="dxa" w:w="2340"/>
+          </w:tcPr>
+          <w:p>
+            <w:r>
+              <w:t>TSS2</w:t>
+            </w:r>
+          </w:p>
+        </w:tc>
+        <w:tc>
+          <w:tcPr>
+            <w:tcW w:type="dxa" w:w="2340"/>
+          </w:tcPr>
+          <w:p>
+            <w:r>
+              <w:t>Snippet</w:t>
+            </w:r>
+          </w:p>
+        </w:tc>
+        <w:tc>
+          <w:tcPr>
+            <w:tcW w:type="dxa" w:w="2340"/>
+          </w:tcPr>
+          <w:p>
+            <w:r>
+              <w:t>Whether new rows are still being appended to the backing CSV/SQL table.</w:t>
+            </w:r>
+          </w:p>
+        </w:tc>
+      </w:tr>
+      <w:tr>
+        <w:tc>
+          <w:tcPr>
+            <w:tcW w:type="dxa" w:w="2340"/>
+          </w:tcPr>
+          <w:p>
+            <w:r>
+              <w:t>TSS2:committedUntil</w:t>
+            </w:r>
+          </w:p>
+        </w:tc>
+        <w:tc>
+          <w:tcPr>
+            <w:tcW w:type="dxa" w:w="2340"/>
+          </w:tcPr>
+          <w:p>
+            <w:r>
+              <w:t>TSS2</w:t>
+            </w:r>
+          </w:p>
+        </w:tc>
+        <w:tc>
+          <w:tcPr>
+            <w:tcW w:type="dxa" w:w="2340"/>
+          </w:tcPr>
+          <w:p>
+            <w:r>
+              <w:t>Snippet</w:t>
+            </w:r>
+          </w:p>
+        </w:tc>
+        <w:tc>
+          <w:tcPr>
+            <w:tcW w:type="dxa" w:w="2340"/>
+          </w:tcPr>
+          <w:p>
+            <w:r>
+              <w:t>Timestamp boundary up to which appended rows are finalized and safe to read.</w:t>
+            </w:r>
+          </w:p>
+        </w:tc>
+      </w:tr>
+      <w:tr>
+        <w:tc>
+          <w:tcPr>
+            <w:tcW w:type="dxa" w:w="2340"/>
+          </w:tcPr>
+          <w:p>
+            <w:r>
+              <w:t>TSS2:producedBy</w:t>
+            </w:r>
+          </w:p>
+        </w:tc>
+        <w:tc>
+          <w:tcPr>
+            <w:tcW w:type="dxa" w:w="2340"/>
+          </w:tcPr>
+          <w:p>
+            <w:r>
+              <w:t>TSS2</w:t>
+            </w:r>
+          </w:p>
+        </w:tc>
+        <w:tc>
+          <w:tcPr>
+            <w:tcW w:type="dxa" w:w="2340"/>
+          </w:tcPr>
+          <w:p>
+            <w:r>
+              <w:t>Snippet</w:t>
+            </w:r>
+          </w:p>
+        </w:tc>
+        <w:tc>
+          <w:tcPr>
+            <w:tcW w:type="dxa" w:w="2340"/>
+          </w:tcPr>
+          <w:p>
+            <w:r>
+              <w:t>The device/system that produced this table's data.</w:t>
+            </w:r>
+          </w:p>
+        </w:tc>
+      </w:tr>
+      <w:tr>
+        <w:tc>
+          <w:tcPr>
+            <w:tcW w:type="dxa" w:w="2340"/>
+          </w:tcPr>
+          <w:p>
+            <w:r>
+              <w:t>ldes:retentionPolicy / ldes:startingFrom</w:t>
+            </w:r>
+          </w:p>
+        </w:tc>
+        <w:tc>
+          <w:tcPr>
+            <w:tcW w:type="dxa" w:w="2340"/>
+          </w:tcPr>
+          <w:p>
+            <w:r>
+              <w:t>LDES</w:t>
+            </w:r>
+          </w:p>
+        </w:tc>
+        <w:tc>
+          <w:tcPr>
+            <w:tcW w:type="dxa" w:w="2340"/>
+          </w:tcPr>
+          <w:p>
+            <w:r>
+              <w:t>Snippet</w:t>
+            </w:r>
+          </w:p>
+        </w:tc>
+        <w:tc>
+          <w:tcPr>
+            <w:tcW w:type="dxa" w:w="2340"/>
+          </w:tcPr>
+          <w:p>
+            <w:r>
+              <w:t>Describes how much history is retained in the backing table.</w:t>
+            </w:r>
+          </w:p>
+        </w:tc>
+      </w:tr>
+      <w:tr>
+        <w:tc>
+          <w:tcPr>
+            <w:tcW w:type="dxa" w:w="2340"/>
+          </w:tcPr>
+          <w:p>
+            <w:r>
+              <w:t>csvw:tableSchema</w:t>
+            </w:r>
+          </w:p>
+        </w:tc>
+        <w:tc>
+          <w:tcPr>
+            <w:tcW w:type="dxa" w:w="2340"/>
+          </w:tcPr>
+          <w:p>
+            <w:r>
+              <w:t>CSVW</w:t>
+            </w:r>
+          </w:p>
+        </w:tc>
+        <w:tc>
+          <w:tcPr>
+            <w:tcW w:type="dxa" w:w="2340"/>
+          </w:tcPr>
+          <w:p>
+            <w:r>
+              <w:t>Snippet</w:t>
+            </w:r>
+          </w:p>
+        </w:tc>
+        <w:tc>
+          <w:tcPr>
+            <w:tcW w:type="dxa" w:w="2340"/>
+          </w:tcPr>
+          <w:p>
+            <w:r>
+              <w:t>Links the table to the schema describing its columns.</w:t>
+            </w:r>
+          </w:p>
+        </w:tc>
+      </w:tr>
+      <w:tr>
+        <w:tc>
+          <w:tcPr>
+            <w:tcW w:type="dxa" w:w="2340"/>
+          </w:tcPr>
+          <w:p>
+            <w:r>
+              <w:t>csvw:primaryKey</w:t>
+            </w:r>
+          </w:p>
+        </w:tc>
+        <w:tc>
+          <w:tcPr>
+            <w:tcW w:type="dxa" w:w="2340"/>
+          </w:tcPr>
+          <w:p>
+            <w:r>
+              <w:t>CSVW</w:t>
+            </w:r>
+          </w:p>
+        </w:tc>
+        <w:tc>
+          <w:tcPr>
+            <w:tcW w:type="dxa" w:w="2340"/>
+          </w:tcPr>
+          <w:p>
+            <w:r>
+              <w:t>Schema</w:t>
+            </w:r>
+          </w:p>
+        </w:tc>
+        <w:tc>
+          <w:tcPr>
+            <w:tcW w:type="dxa" w:w="2340"/>
+          </w:tcPr>
+          <w:p>
+            <w:r>
+              <w:t>Names the column that uniquely identifies each row (the timestamp column).</w:t>
+            </w:r>
+          </w:p>
+        </w:tc>
+      </w:tr>
+      <w:tr>
+        <w:tc>
+          <w:tcPr>
+            <w:tcW w:type="dxa" w:w="2340"/>
+          </w:tcPr>
+          <w:p>
+            <w:r>
+              <w:t>TSS2:columnIndex</w:t>
+            </w:r>
+          </w:p>
+        </w:tc>
+        <w:tc>
+          <w:tcPr>
+            <w:tcW w:type="dxa" w:w="2340"/>
+          </w:tcPr>
+          <w:p>
+            <w:r>
+              <w:t>TSS2</w:t>
+            </w:r>
+          </w:p>
+        </w:tc>
+        <w:tc>
+          <w:tcPr>
+            <w:tcW w:type="dxa" w:w="2340"/>
+          </w:tcPr>
+          <w:p>
+            <w:r>
+              <w:t>Column</w:t>
+            </w:r>
+          </w:p>
+        </w:tc>
+        <w:tc>
+          <w:tcPr>
+            <w:tcW w:type="dxa" w:w="2340"/>
+          </w:tcPr>
+          <w:p>
+            <w:r>
+              <w:t>Position of this column in the CSV (0-based), since list order isn't always preserved by tooling.</w:t>
+            </w:r>
+          </w:p>
+        </w:tc>
+      </w:tr>
+      <w:tr>
+        <w:tc>
+          <w:tcPr>
+            <w:tcW w:type="dxa" w:w="2340"/>
+          </w:tcPr>
+          <w:p>
+            <w:r>
+              <w:t>TSS2:isTimestampColumn</w:t>
+            </w:r>
+          </w:p>
+        </w:tc>
+        <w:tc>
+          <w:tcPr>
+            <w:tcW w:type="dxa" w:w="2340"/>
+          </w:tcPr>
+          <w:p>
+            <w:r>
+              <w:t>TSS2</w:t>
+            </w:r>
+          </w:p>
+        </w:tc>
+        <w:tc>
+          <w:tcPr>
+            <w:tcW w:type="dxa" w:w="2340"/>
+          </w:tcPr>
+          <w:p>
+            <w:r>
+              <w:t>Column</w:t>
+            </w:r>
+          </w:p>
+        </w:tc>
+        <w:tc>
+          <w:tcPr>
+            <w:tcW w:type="dxa" w:w="2340"/>
+          </w:tcPr>
+          <w:p>
+            <w:r>
+              <w:t>Flags this column as the time axis of the series.</w:t>
+            </w:r>
+          </w:p>
+        </w:tc>
+      </w:tr>
+      <w:tr>
+        <w:tc>
+          <w:tcPr>
+            <w:tcW w:type="dxa" w:w="2340"/>
+          </w:tcPr>
+          <w:p>
+            <w:r>
+              <w:t>csvw:name</w:t>
+            </w:r>
+          </w:p>
+        </w:tc>
+        <w:tc>
+          <w:tcPr>
+            <w:tcW w:type="dxa" w:w="2340"/>
+          </w:tcPr>
+          <w:p>
+            <w:r>
+              <w:t>CSVW</w:t>
+            </w:r>
+          </w:p>
+        </w:tc>
+        <w:tc>
+          <w:tcPr>
+            <w:tcW w:type="dxa" w:w="2340"/>
+          </w:tcPr>
+          <w:p>
+            <w:r>
+              <w:t>Column</w:t>
+            </w:r>
+          </w:p>
+        </w:tc>
+        <w:tc>
+          <w:tcPr>
+            <w:tcW w:type="dxa" w:w="2340"/>
+          </w:tcPr>
+          <w:p>
+            <w:r>
+              <w:t>Internal/machine identifier for the column, matching the CSV header.</w:t>
+            </w:r>
+          </w:p>
+        </w:tc>
+      </w:tr>
+      <w:tr>
+        <w:tc>
+          <w:tcPr>
+            <w:tcW w:type="dxa" w:w="2340"/>
+          </w:tcPr>
+          <w:p>
+            <w:r>
+              <w:t>csvw:title</w:t>
+            </w:r>
+          </w:p>
+        </w:tc>
+        <w:tc>
+          <w:tcPr>
+            <w:tcW w:type="dxa" w:w="2340"/>
+          </w:tcPr>
+          <w:p>
+            <w:r>
+              <w:t>CSVW</w:t>
+            </w:r>
+          </w:p>
+        </w:tc>
+        <w:tc>
+          <w:tcPr>
+            <w:tcW w:type="dxa" w:w="2340"/>
+          </w:tcPr>
+          <w:p>
+            <w:r>
+              <w:t>Column</w:t>
+            </w:r>
+          </w:p>
+        </w:tc>
+        <w:tc>
+          <w:tcPr>
+            <w:tcW w:type="dxa" w:w="2340"/>
+          </w:tcPr>
+          <w:p>
+            <w:r>
+              <w:t>Human-readable label for the column.</w:t>
+            </w:r>
+          </w:p>
+        </w:tc>
+      </w:tr>
+      <w:tr>
+        <w:tc>
+          <w:tcPr>
+            <w:tcW w:type="dxa" w:w="2340"/>
+          </w:tcPr>
+          <w:p>
+            <w:r>
+              <w:t>csvw:datatype</w:t>
+            </w:r>
+          </w:p>
+        </w:tc>
+        <w:tc>
+          <w:tcPr>
+            <w:tcW w:type="dxa" w:w="2340"/>
+          </w:tcPr>
+          <w:p>
+            <w:r>
+              <w:t>CSVW</w:t>
+            </w:r>
+          </w:p>
+        </w:tc>
+        <w:tc>
+          <w:tcPr>
+            <w:tcW w:type="dxa" w:w="2340"/>
+          </w:tcPr>
+          <w:p>
+            <w:r>
+              <w:t>Column</w:t>
+            </w:r>
+          </w:p>
+        </w:tc>
+        <w:tc>
+          <w:tcPr>
+            <w:tcW w:type="dxa" w:w="2340"/>
+          </w:tcPr>
+          <w:p>
+            <w:r>
+              <w:t>Expected XSD datatype of the column's values.</w:t>
+            </w:r>
+          </w:p>
+        </w:tc>
+      </w:tr>
+      <w:tr>
+        <w:tc>
+          <w:tcPr>
+            <w:tcW w:type="dxa" w:w="2340"/>
+          </w:tcPr>
+          <w:p>
+            <w:r>
+              <w:t>csvw:required</w:t>
+            </w:r>
+          </w:p>
+        </w:tc>
+        <w:tc>
+          <w:tcPr>
+            <w:tcW w:type="dxa" w:w="2340"/>
+          </w:tcPr>
+          <w:p>
+            <w:r>
+              <w:t>CSVW</w:t>
+            </w:r>
+          </w:p>
+        </w:tc>
+        <w:tc>
+          <w:tcPr>
+            <w:tcW w:type="dxa" w:w="2340"/>
+          </w:tcPr>
+          <w:p>
+            <w:r>
+              <w:t>Column</w:t>
+            </w:r>
+          </w:p>
+        </w:tc>
+        <w:tc>
+          <w:tcPr>
+            <w:tcW w:type="dxa" w:w="2340"/>
+          </w:tcPr>
+          <w:p>
+            <w:r>
+              <w:t>Whether every row must have a non-null value in this column.</w:t>
+            </w:r>
+          </w:p>
+        </w:tc>
+      </w:tr>
+      <w:tr>
+        <w:tc>
+          <w:tcPr>
+            <w:tcW w:type="dxa" w:w="2340"/>
+          </w:tcPr>
+          <w:p>
+            <w:r>
+              <w:t>qudt:hasUnit</w:t>
+            </w:r>
+          </w:p>
+        </w:tc>
+        <w:tc>
+          <w:tcPr>
+            <w:tcW w:type="dxa" w:w="2340"/>
+          </w:tcPr>
+          <w:p>
+            <w:r>
+              <w:t>QUDT</w:t>
+            </w:r>
+          </w:p>
+        </w:tc>
+        <w:tc>
+          <w:tcPr>
+            <w:tcW w:type="dxa" w:w="2340"/>
+          </w:tcPr>
+          <w:p>
+            <w:r>
+              <w:t>Column</w:t>
+            </w:r>
+          </w:p>
+        </w:tc>
+        <w:tc>
+          <w:tcPr>
+            <w:tcW w:type="dxa" w:w="2340"/>
+          </w:tcPr>
+          <w:p>
+            <w:r>
+              <w:t>Unit of measurement for the column's values (e.g. degrees Celsius, meters).</w:t>
+            </w:r>
+          </w:p>
+        </w:tc>
+      </w:tr>
+      <w:tr>
+        <w:tc>
+          <w:tcPr>
+            <w:tcW w:type="dxa" w:w="2340"/>
+          </w:tcPr>
+          <w:p>
+            <w:r>
+              <w:t>sosa:observedProperty</w:t>
+            </w:r>
+          </w:p>
+        </w:tc>
+        <w:tc>
+          <w:tcPr>
+            <w:tcW w:type="dxa" w:w="2340"/>
+          </w:tcPr>
+          <w:p>
+            <w:r>
+              <w:t>SOSA</w:t>
+            </w:r>
+          </w:p>
+        </w:tc>
+        <w:tc>
+          <w:tcPr>
+            <w:tcW w:type="dxa" w:w="2340"/>
+          </w:tcPr>
+          <w:p>
+            <w:r>
+              <w:t>Column</w:t>
+            </w:r>
+          </w:p>
+        </w:tc>
+        <w:tc>
+          <w:tcPr>
+            <w:tcW w:type="dxa" w:w="2340"/>
+          </w:tcPr>
+          <w:p>
+            <w:r>
+              <w:t>What physical quantity this column measures (e.g. Temperature, Length).</w:t>
+            </w:r>
+          </w:p>
+        </w:tc>
+      </w:tr>
+      <w:tr>
+        <w:tc>
+          <w:tcPr>
+            <w:tcW w:type="dxa" w:w="2340"/>
+          </w:tcPr>
+          <w:p>
+            <w:r>
+              <w:t>sosa:madeBySensor</w:t>
+            </w:r>
+          </w:p>
+        </w:tc>
+        <w:tc>
+          <w:tcPr>
+            <w:tcW w:type="dxa" w:w="2340"/>
+          </w:tcPr>
+          <w:p>
+            <w:r>
+              <w:t>SOSA</w:t>
+            </w:r>
+          </w:p>
+        </w:tc>
+        <w:tc>
+          <w:tcPr>
+            <w:tcW w:type="dxa" w:w="2340"/>
+          </w:tcPr>
+          <w:p>
+            <w:r>
+              <w:t>Column</w:t>
+            </w:r>
+          </w:p>
+        </w:tc>
+        <w:tc>
+          <w:tcPr>
+            <w:tcW w:type="dxa" w:w="2340"/>
+          </w:tcPr>
+          <w:p>
+            <w:r>
+              <w:t>Which physical sensor produced this column's readings.</w:t>
+            </w:r>
+          </w:p>
+        </w:tc>
+      </w:tr>
+    </w:tbl>
     <w:sectPr>
       <w:pgSz w:w="12240" w:h="15840"/>
       <w:pgMar w:top="1440" w:right="1440" w:bottom="1440" w:left="1440" w:header="720" w:footer="720" w:gutter="0"/>

</xml_diff>

<commit_message>
Add architecture diagram and spec update
This commit adds the project architecture diagram in draw.io and SVG formats, updates the specification document, and includes the generated assets for the RDF Time Series design.
</commit_message>
<xml_diff>
--- a/Spec document.docx
+++ b/Spec document.docx
@@ -33,15 +33,7 @@
         <w:t xml:space="preserve">, </w:t>
       </w:r>
       <w:r>
-        <w:t xml:space="preserve">but the RDF description still </w:t>
-      </w:r>
-      <w:proofErr w:type="gramStart"/>
-      <w:r>
-        <w:t>has to</w:t>
-      </w:r>
-      <w:proofErr w:type="gramEnd"/>
-      <w:r>
-        <w:t xml:space="preserve"> be complete enough that a consumer never needs to open the CSV to understand </w:t>
+        <w:t xml:space="preserve">but the RDF description still has to be complete enough that a consumer never needs to open the CSV to understand </w:t>
       </w:r>
       <w:r>
         <w:rPr>
@@ -155,7 +147,18 @@
         <w:t>Unanswered questions</w:t>
       </w:r>
     </w:p>
-    <w:p/>
+    <w:p>
+      <w:pPr>
+        <w:pStyle w:val="ListParagraph"/>
+        <w:numPr>
+          <w:ilvl w:val="0"/>
+          <w:numId w:val="4"/>
+        </w:numPr>
+      </w:pPr>
+      <w:r>
+        <w:t>How do we provide links to R2RML mappings and ontology for the time series data?</w:t>
+      </w:r>
+    </w:p>
     <w:p>
       <w:pPr>
         <w:pStyle w:val="Heading1"/>
@@ -248,11 +251,9 @@
             <w:tcW w:w="0" w:type="auto"/>
           </w:tcPr>
           <w:p>
-            <w:proofErr w:type="spellStart"/>
             <w:r>
               <w:t>rdf:type</w:t>
             </w:r>
-            <w:proofErr w:type="spellEnd"/>
           </w:p>
         </w:tc>
         <w:tc>
@@ -281,15 +282,7 @@
           </w:tcPr>
           <w:p>
             <w:r>
-              <w:t xml:space="preserve">Marks the resource as both a TSS2:Snippet and a </w:t>
-            </w:r>
-            <w:proofErr w:type="spellStart"/>
-            <w:r>
-              <w:t>csvw:Table</w:t>
-            </w:r>
-            <w:proofErr w:type="spellEnd"/>
-            <w:r>
-              <w:t>.</w:t>
+              <w:t>Marks the resource as both a TSS2:Snippet and a csvw:Table.</w:t>
             </w:r>
           </w:p>
         </w:tc>
@@ -300,12 +293,10 @@
             <w:tcW w:w="0" w:type="auto"/>
           </w:tcPr>
           <w:p>
-            <w:proofErr w:type="spellStart"/>
             <w:r>
               <w:lastRenderedPageBreak/>
               <w:t>csvw:url</w:t>
             </w:r>
-            <w:proofErr w:type="spellEnd"/>
           </w:p>
         </w:tc>
         <w:tc>
@@ -516,19 +507,9 @@
             <w:tcW w:w="0" w:type="auto"/>
           </w:tcPr>
           <w:p>
-            <w:proofErr w:type="spellStart"/>
-            <w:r>
-              <w:t>ldes:retentionPolicy</w:t>
-            </w:r>
-            <w:proofErr w:type="spellEnd"/>
-            <w:r>
-              <w:t xml:space="preserve"> / </w:t>
-            </w:r>
-            <w:proofErr w:type="spellStart"/>
-            <w:r>
-              <w:t>ldes:startingFrom</w:t>
-            </w:r>
-            <w:proofErr w:type="spellEnd"/>
+            <w:r>
+              <w:t>ldes:retentionPolicy / ldes:startingFrom</w:t>
+            </w:r>
           </w:p>
         </w:tc>
         <w:tc>
@@ -568,11 +549,9 @@
             <w:tcW w:w="0" w:type="auto"/>
           </w:tcPr>
           <w:p>
-            <w:proofErr w:type="spellStart"/>
             <w:r>
               <w:t>csvw:tableSchema</w:t>
             </w:r>
-            <w:proofErr w:type="spellEnd"/>
           </w:p>
         </w:tc>
         <w:tc>
@@ -612,11 +591,9 @@
             <w:tcW w:w="0" w:type="auto"/>
           </w:tcPr>
           <w:p>
-            <w:proofErr w:type="spellStart"/>
             <w:r>
               <w:t>csvw:primaryKey</w:t>
             </w:r>
-            <w:proofErr w:type="spellEnd"/>
           </w:p>
         </w:tc>
         <w:tc>
@@ -740,11 +717,9 @@
             <w:tcW w:w="0" w:type="auto"/>
           </w:tcPr>
           <w:p>
-            <w:proofErr w:type="spellStart"/>
             <w:r>
               <w:t>csvw:name</w:t>
             </w:r>
-            <w:proofErr w:type="spellEnd"/>
           </w:p>
         </w:tc>
         <w:tc>
@@ -784,11 +759,9 @@
             <w:tcW w:w="0" w:type="auto"/>
           </w:tcPr>
           <w:p>
-            <w:proofErr w:type="spellStart"/>
             <w:r>
               <w:t>csvw:title</w:t>
             </w:r>
-            <w:proofErr w:type="spellEnd"/>
           </w:p>
         </w:tc>
         <w:tc>
@@ -828,12 +801,10 @@
             <w:tcW w:w="0" w:type="auto"/>
           </w:tcPr>
           <w:p>
-            <w:proofErr w:type="spellStart"/>
             <w:r>
               <w:lastRenderedPageBreak/>
               <w:t>csvw:datatype</w:t>
             </w:r>
-            <w:proofErr w:type="spellEnd"/>
           </w:p>
         </w:tc>
         <w:tc>
@@ -873,11 +844,9 @@
             <w:tcW w:w="0" w:type="auto"/>
           </w:tcPr>
           <w:p>
-            <w:proofErr w:type="spellStart"/>
             <w:r>
               <w:t>csvw:required</w:t>
             </w:r>
-            <w:proofErr w:type="spellEnd"/>
           </w:p>
         </w:tc>
         <w:tc>
@@ -917,11 +886,9 @@
             <w:tcW w:w="0" w:type="auto"/>
           </w:tcPr>
           <w:p>
-            <w:proofErr w:type="spellStart"/>
             <w:r>
               <w:t>qudt:hasUnit</w:t>
             </w:r>
-            <w:proofErr w:type="spellEnd"/>
           </w:p>
         </w:tc>
         <w:tc>
@@ -961,11 +928,9 @@
             <w:tcW w:w="0" w:type="auto"/>
           </w:tcPr>
           <w:p>
-            <w:proofErr w:type="spellStart"/>
             <w:r>
               <w:t>sosa:observedProperty</w:t>
             </w:r>
-            <w:proofErr w:type="spellEnd"/>
           </w:p>
         </w:tc>
         <w:tc>
@@ -994,23 +959,7 @@
           </w:tcPr>
           <w:p>
             <w:r>
-              <w:t xml:space="preserve">What physical </w:t>
-            </w:r>
-            <w:proofErr w:type="gramStart"/>
-            <w:r>
-              <w:t>quantity</w:t>
-            </w:r>
-            <w:proofErr w:type="gramEnd"/>
-            <w:r>
-              <w:t xml:space="preserve"> this column </w:t>
-            </w:r>
-            <w:proofErr w:type="gramStart"/>
-            <w:r>
-              <w:t>measures</w:t>
-            </w:r>
-            <w:proofErr w:type="gramEnd"/>
-            <w:r>
-              <w:t xml:space="preserve"> (e.g. Temperature, Length).</w:t>
+              <w:t>What physical quantity this column measures (e.g. Temperature, Length).</w:t>
             </w:r>
           </w:p>
         </w:tc>
@@ -1021,11 +970,9 @@
             <w:tcW w:w="0" w:type="auto"/>
           </w:tcPr>
           <w:p>
-            <w:proofErr w:type="spellStart"/>
             <w:r>
               <w:t>sosa:madeBySensor</w:t>
             </w:r>
-            <w:proofErr w:type="spellEnd"/>
           </w:p>
         </w:tc>
         <w:tc>
@@ -1074,6 +1021,119 @@
 <file path=word/numbering.xml><?xml version="1.0" encoding="utf-8"?>
 <w:numbering xmlns:wpc="http://schemas.microsoft.com/office/word/2010/wordprocessingCanvas" xmlns:cx="http://schemas.microsoft.com/office/drawing/2014/chartex" xmlns:cx1="http://schemas.microsoft.com/office/drawing/2015/9/8/chartex" xmlns:cx2="http://schemas.microsoft.com/office/drawing/2015/10/21/chartex" xmlns:cx3="http://schemas.microsoft.com/office/drawing/2016/5/9/chartex" xmlns:cx4="http://schemas.microsoft.com/office/drawing/2016/5/10/chartex" xmlns:cx5="http://schemas.microsoft.com/office/drawing/2016/5/11/chartex" xmlns:cx6="http://schemas.microsoft.com/office/drawing/2016/5/12/chartex" xmlns:cx7="http://schemas.microsoft.com/office/drawing/2016/5/13/chartex" xmlns:cx8="http://schemas.microsoft.com/office/drawing/2016/5/14/chartex" xmlns:mc="http://schemas.openxmlformats.org/markup-compatibility/2006" xmlns:aink="http://schemas.microsoft.com/office/drawing/2016/ink" xmlns:am3d="http://schemas.microsoft.com/office/drawing/2017/model3d" xmlns:o="urn:schemas-microsoft-com:office:office" xmlns:oel="http://schemas.microsoft.com/office/2019/extlst" xmlns:r="http://schemas.openxmlformats.org/officeDocument/2006/relationships" xmlns:m="http://schemas.openxmlformats.org/officeDocument/2006/math" xmlns:v="urn:schemas-microsoft-com:vml" xmlns:wp14="http://schemas.microsoft.com/office/word/2010/wordprocessingDrawing" xmlns:wp="http://schemas.openxmlformats.org/drawingml/2006/wordprocessingDrawing" xmlns:w10="urn:schemas-microsoft-com:office:word" xmlns:w="http://schemas.openxmlformats.org/wordprocessingml/2006/main" xmlns:w14="http://schemas.microsoft.com/office/word/2010/wordml" xmlns:w15="http://schemas.microsoft.com/office/word/2012/wordml" xmlns:w16cei="http://schemas.microsoft.com/office/word/2026/wordml/cei" xmlns:w16cex="http://schemas.microsoft.com/office/word/2018/wordml/cex" xmlns:w16cid="http://schemas.microsoft.com/office/word/2016/wordml/cid" xmlns:w16="http://schemas.microsoft.com/office/word/2018/wordml" xmlns:w16du="http://schemas.microsoft.com/office/word/2023/wordml/word16du" xmlns:w16sdtdh="http://schemas.microsoft.com/office/word/2020/wordml/sdtdatahash" xmlns:w16sdtfl="http://schemas.microsoft.com/office/word/2024/wordml/sdtformatlock" xmlns:w16se="http://schemas.microsoft.com/office/word/2015/wordml/symex" xmlns:wpg="http://schemas.microsoft.com/office/word/2010/wordprocessingGroup" xmlns:wpi="http://schemas.microsoft.com/office/word/2010/wordprocessingInk" xmlns:wne="http://schemas.microsoft.com/office/word/2006/wordml" xmlns:wps="http://schemas.microsoft.com/office/word/2010/wordprocessingShape" mc:Ignorable="w14 w15 w16se w16cid w16 w16cex w16sdtdh w16sdtfl w16du wp14">
   <w:abstractNum w:abstractNumId="0" w15:restartNumberingAfterBreak="0">
+    <w:nsid w:val="02F8138F"/>
+    <w:multiLevelType w:val="hybridMultilevel"/>
+    <w:tmpl w:val="33D4DC4C"/>
+    <w:lvl w:ilvl="0" w:tplc="04090001">
+      <w:start w:val="1"/>
+      <w:numFmt w:val="bullet"/>
+      <w:lvlText w:val=""/>
+      <w:lvlJc w:val="left"/>
+      <w:pPr>
+        <w:ind w:left="720" w:hanging="360"/>
+      </w:pPr>
+      <w:rPr>
+        <w:rFonts w:ascii="Symbol" w:hAnsi="Symbol" w:hint="default"/>
+      </w:rPr>
+    </w:lvl>
+    <w:lvl w:ilvl="1" w:tplc="04090003" w:tentative="1">
+      <w:start w:val="1"/>
+      <w:numFmt w:val="bullet"/>
+      <w:lvlText w:val="o"/>
+      <w:lvlJc w:val="left"/>
+      <w:pPr>
+        <w:ind w:left="1440" w:hanging="360"/>
+      </w:pPr>
+      <w:rPr>
+        <w:rFonts w:ascii="Courier New" w:hAnsi="Courier New" w:cs="Courier New" w:hint="default"/>
+      </w:rPr>
+    </w:lvl>
+    <w:lvl w:ilvl="2" w:tplc="04090005" w:tentative="1">
+      <w:start w:val="1"/>
+      <w:numFmt w:val="bullet"/>
+      <w:lvlText w:val=""/>
+      <w:lvlJc w:val="left"/>
+      <w:pPr>
+        <w:ind w:left="2160" w:hanging="360"/>
+      </w:pPr>
+      <w:rPr>
+        <w:rFonts w:ascii="Wingdings" w:hAnsi="Wingdings" w:hint="default"/>
+      </w:rPr>
+    </w:lvl>
+    <w:lvl w:ilvl="3" w:tplc="04090001" w:tentative="1">
+      <w:start w:val="1"/>
+      <w:numFmt w:val="bullet"/>
+      <w:lvlText w:val=""/>
+      <w:lvlJc w:val="left"/>
+      <w:pPr>
+        <w:ind w:left="2880" w:hanging="360"/>
+      </w:pPr>
+      <w:rPr>
+        <w:rFonts w:ascii="Symbol" w:hAnsi="Symbol" w:hint="default"/>
+      </w:rPr>
+    </w:lvl>
+    <w:lvl w:ilvl="4" w:tplc="04090003" w:tentative="1">
+      <w:start w:val="1"/>
+      <w:numFmt w:val="bullet"/>
+      <w:lvlText w:val="o"/>
+      <w:lvlJc w:val="left"/>
+      <w:pPr>
+        <w:ind w:left="3600" w:hanging="360"/>
+      </w:pPr>
+      <w:rPr>
+        <w:rFonts w:ascii="Courier New" w:hAnsi="Courier New" w:cs="Courier New" w:hint="default"/>
+      </w:rPr>
+    </w:lvl>
+    <w:lvl w:ilvl="5" w:tplc="04090005" w:tentative="1">
+      <w:start w:val="1"/>
+      <w:numFmt w:val="bullet"/>
+      <w:lvlText w:val=""/>
+      <w:lvlJc w:val="left"/>
+      <w:pPr>
+        <w:ind w:left="4320" w:hanging="360"/>
+      </w:pPr>
+      <w:rPr>
+        <w:rFonts w:ascii="Wingdings" w:hAnsi="Wingdings" w:hint="default"/>
+      </w:rPr>
+    </w:lvl>
+    <w:lvl w:ilvl="6" w:tplc="04090001" w:tentative="1">
+      <w:start w:val="1"/>
+      <w:numFmt w:val="bullet"/>
+      <w:lvlText w:val=""/>
+      <w:lvlJc w:val="left"/>
+      <w:pPr>
+        <w:ind w:left="5040" w:hanging="360"/>
+      </w:pPr>
+      <w:rPr>
+        <w:rFonts w:ascii="Symbol" w:hAnsi="Symbol" w:hint="default"/>
+      </w:rPr>
+    </w:lvl>
+    <w:lvl w:ilvl="7" w:tplc="04090003" w:tentative="1">
+      <w:start w:val="1"/>
+      <w:numFmt w:val="bullet"/>
+      <w:lvlText w:val="o"/>
+      <w:lvlJc w:val="left"/>
+      <w:pPr>
+        <w:ind w:left="5760" w:hanging="360"/>
+      </w:pPr>
+      <w:rPr>
+        <w:rFonts w:ascii="Courier New" w:hAnsi="Courier New" w:cs="Courier New" w:hint="default"/>
+      </w:rPr>
+    </w:lvl>
+    <w:lvl w:ilvl="8" w:tplc="04090005" w:tentative="1">
+      <w:start w:val="1"/>
+      <w:numFmt w:val="bullet"/>
+      <w:lvlText w:val=""/>
+      <w:lvlJc w:val="left"/>
+      <w:pPr>
+        <w:ind w:left="6480" w:hanging="360"/>
+      </w:pPr>
+      <w:rPr>
+        <w:rFonts w:ascii="Wingdings" w:hAnsi="Wingdings" w:hint="default"/>
+      </w:rPr>
+    </w:lvl>
+  </w:abstractNum>
+  <w:abstractNum w:abstractNumId="1" w15:restartNumberingAfterBreak="0">
     <w:nsid w:val="0DD26360"/>
     <w:multiLevelType w:val="hybridMultilevel"/>
     <w:tmpl w:val="572CC5D8"/>
@@ -1186,7 +1246,7 @@
       </w:rPr>
     </w:lvl>
   </w:abstractNum>
-  <w:abstractNum w:abstractNumId="1" w15:restartNumberingAfterBreak="0">
+  <w:abstractNum w:abstractNumId="2" w15:restartNumberingAfterBreak="0">
     <w:nsid w:val="6F612FEC"/>
     <w:multiLevelType w:val="hybridMultilevel"/>
     <w:tmpl w:val="6EE4C3C2"/>
@@ -1299,7 +1359,7 @@
       </w:rPr>
     </w:lvl>
   </w:abstractNum>
-  <w:abstractNum w:abstractNumId="2" w15:restartNumberingAfterBreak="0">
+  <w:abstractNum w:abstractNumId="3" w15:restartNumberingAfterBreak="0">
     <w:nsid w:val="7E9F6C63"/>
     <w:multiLevelType w:val="hybridMultilevel"/>
     <w:tmpl w:val="E58E341A"/>
@@ -1413,13 +1473,16 @@
     </w:lvl>
   </w:abstractNum>
   <w:num w:numId="1" w16cid:durableId="228881815">
+    <w:abstractNumId w:val="3"/>
+  </w:num>
+  <w:num w:numId="2" w16cid:durableId="1369522800">
+    <w:abstractNumId w:val="1"/>
+  </w:num>
+  <w:num w:numId="3" w16cid:durableId="1729106206">
     <w:abstractNumId w:val="2"/>
   </w:num>
-  <w:num w:numId="2" w16cid:durableId="1369522800">
+  <w:num w:numId="4" w16cid:durableId="316542265">
     <w:abstractNumId w:val="0"/>
-  </w:num>
-  <w:num w:numId="3" w16cid:durableId="1729106206">
-    <w:abstractNumId w:val="1"/>
   </w:num>
 </w:numbering>
 </file>

</xml_diff>